<commit_message>
fix(inversiones): más espacio sobre las firmas del contrato de sociedad
El cuadro de firma de WeeTrust mide 50 puntos y entre el párrafo de cierre
("…firmamos en la ciudad de Guatemala…") y la raya había 33: los dos
cuadros tapaban las últimas líneas. Dos enters más antes de la tabla de
firmas, en hombre y mujer; el contrato sigue en 8 páginas.

Co-Authored-By: Claude Opus 5.5 <noreply@anthropic.com>
</commit_message>
<xml_diff>
--- a/apps/legal-docs-blueprints/templates/inversiones_Sociedad/contrato_participacion_administracion_cartera/contrato_participacion_administracion_cartera_hombre.docx
+++ b/apps/legal-docs-blueprints/templates/inversiones_Sociedad/contrato_participacion_administracion_cartera/contrato_participacion_administracion_cartera_hombre.docx
@@ -4638,6 +4638,30 @@
         </w:rPr>
         <w:t xml:space="preserve">{diaTexto} de {mesTexto} de dos mil {anoTexto}.</w:t>
       </w:r>
+      <w:r>
+        <w:rPr>
+          <w:rtl w:val="0"/>
+        </w:rPr>
+      </w:r>
+    </w:p>
+    <w:p>
+      <w:pPr>
+        <w:spacing w:line="360" w:lineRule="auto"/>
+        <w:jc w:val="both"/>
+        <w:rPr/>
+      </w:pPr>
+      <w:r>
+        <w:rPr>
+          <w:rtl w:val="0"/>
+        </w:rPr>
+      </w:r>
+    </w:p>
+    <w:p>
+      <w:pPr>
+        <w:spacing w:line="360" w:lineRule="auto"/>
+        <w:jc w:val="both"/>
+        <w:rPr/>
+      </w:pPr>
       <w:r>
         <w:rPr>
           <w:rtl w:val="0"/>

</xml_diff>